<commit_message>
Dercy Parte 1: gancho mais sombrio
Co-Authored-By: Claude Opus 5.5 <noreply@anthropic.com>
Claude-Session: https://claude.ai/code/session_01MJjUEEZrxQDEUifKK2vj9g
</commit_message>
<xml_diff>
--- a/roteiros/dercy/Dercy_Parte1.docx
+++ b/roteiros/dercy/Dercy_Parte1.docx
@@ -15,7 +15,7 @@
         <w:rPr>
           <w:color w:val="C00000"/>
         </w:rPr>
-        <w:t>Dercy Gonçalves pediu, antes de morrer, para ser enterrada em pé. E durante oito anos o Brasil inteiro acreditou que esse último desejo tinha sido cumprido.</w:t>
+        <w:t>Dercy Gonçalves foi enterrada em pé em dois mil e oito. Oito anos depois, quando abriram o túmulo dela diante das câmeras, o que encontraram lá dentro deixou o Brasil inteiro em choque.</w:t>
       </w:r>
     </w:p>
     <w:p>
@@ -23,7 +23,7 @@
         <w:rPr>
           <w:color w:val="C00000"/>
         </w:rPr>
-        <w:t>O que pouca gente sabe é que, logo depois do enterro, alguém voltou ao túmulo dela. E fez com o caixão uma coisa que ela nunca autorizou.</w:t>
+        <w:t>O que pouca gente sabe é que, logo depois do enterro, alguém voltou àquele túmulo e mexeu no caixão dela. E isso ficou escondido do público durante anos.</w:t>
       </w:r>
     </w:p>
     <w:p>
@@ -31,7 +31,7 @@
         <w:rPr>
           <w:color w:val="C00000"/>
         </w:rPr>
-        <w:t>Fique até o final, porque você vai descobrir o que fizeram com o caixão de Dercy Gonçalves. E por que a mulher que nunca obedeceu ninguém foi desobedecida justamente depois de morta.</w:t>
+        <w:t>Fique até o final, porque você vai descobrir o que encontraram dentro daquela sepultura. E quem teve coragem de desobedecer a última vontade de Dercy Gonçalves.</w:t>
       </w:r>
     </w:p>
     <w:p>

</xml_diff>

<commit_message>
Dercy Parte 1: gancho sem detalhe da posição
Co-Authored-By: Claude Opus 5.5 <noreply@anthropic.com>
Claude-Session: https://claude.ai/code/session_01MJjUEEZrxQDEUifKK2vj9g
</commit_message>
<xml_diff>
--- a/roteiros/dercy/Dercy_Parte1.docx
+++ b/roteiros/dercy/Dercy_Parte1.docx
@@ -15,7 +15,7 @@
         <w:rPr>
           <w:color w:val="C00000"/>
         </w:rPr>
-        <w:t>Dercy Gonçalves foi enterrada em pé em dois mil e oito. Oito anos depois, quando abriram o túmulo dela diante das câmeras, o que encontraram lá dentro deixou o Brasil inteiro em choque.</w:t>
+        <w:t>Dercy Gonçalves morreu em dois mil e oito, aos cento e um anos. Oito anos depois, quando abriram o túmulo dela diante das câmeras, o que encontraram lá dentro deixou o Brasil inteiro em choque.</w:t>
       </w:r>
     </w:p>
     <w:p>
@@ -39,7 +39,7 @@
         <w:rPr>
           <w:color w:val="000000"/>
         </w:rPr>
-        <w:t>Para entender por que uma mulher de cento e um anos fez tanta questão de ficar em pé dentro da própria sepultura, é preciso voltar quase um século.</w:t>
+        <w:t>Para entender o que aconteceu dentro daquele túmulo, é preciso voltar quase um século.</w:t>
       </w:r>
     </w:p>
     <w:p>
@@ -191,7 +191,7 @@
         <w:rPr>
           <w:color w:val="C00000"/>
         </w:rPr>
-        <w:t>O que aquela mãe fez em seguida marcou Dercy para o resto da vida. E ajuda a explicar por que, oitenta anos depois, ela não quis depender de ninguém nem para escolher a posição do próprio corpo dentro de um túmulo.</w:t>
+        <w:t>O que aquela mãe fez em seguida marcou Dercy para o resto da vida. E ajuda a explicar por que, oitenta anos depois, ela não quis depender de ninguém nem para decidir o que seria feito com o próprio corpo depois da morte.</w:t>
       </w:r>
     </w:p>
     <w:p>
@@ -567,7 +567,7 @@
         <w:rPr>
           <w:color w:val="C00000"/>
         </w:rPr>
-        <w:t>E é aqui que esta história fica sombria. Porque a mulher que fugiu da cidade agarrada embaixo de um trem pediu para voltar a ela de pé, como quem continua caminhando. E o que fizeram com esse pedido, você vai descobrir nos próximos minutos.</w:t>
+        <w:t>E é aqui que esta história fica sombria. Porque a mulher que fugiu da cidade agarrada embaixo de um trem pediu para voltar a ela de um jeito muito específico. E o que fizeram com esse pedido, você vai descobrir nos próximos minutos.</w:t>
       </w:r>
     </w:p>
     <w:sectPr>

</xml_diff>

<commit_message>
Dercy Parte 1: gancho focado no caixão
Co-Authored-By: Claude Opus 5.5 <noreply@anthropic.com>
Claude-Session: https://claude.ai/code/session_01MJjUEEZrxQDEUifKK2vj9g
</commit_message>
<xml_diff>
--- a/roteiros/dercy/Dercy_Parte1.docx
+++ b/roteiros/dercy/Dercy_Parte1.docx
@@ -15,7 +15,7 @@
         <w:rPr>
           <w:color w:val="C00000"/>
         </w:rPr>
-        <w:t>Dercy Gonçalves morreu em dois mil e oito, aos cento e um anos. Oito anos depois, quando abriram o túmulo dela diante das câmeras, o que encontraram lá dentro deixou o Brasil inteiro em choque.</w:t>
+        <w:t>Dercy Gonçalves morreu em dois mil e oito, aos cento e um anos. Oito anos depois, abriram o túmulo dela diante das câmeras. E o que viram naquele caixão revelou uma traição arrepiante.</w:t>
       </w:r>
     </w:p>
     <w:p>
@@ -23,7 +23,7 @@
         <w:rPr>
           <w:color w:val="C00000"/>
         </w:rPr>
-        <w:t>O que pouca gente sabe é que, logo depois do enterro, alguém voltou àquele túmulo e mexeu no caixão dela. E isso ficou escondido do público durante anos.</w:t>
+        <w:t>O que pouca gente sabe é que, poucos dias depois do enterro, alguém voltou àquele túmulo, às escondidas, e mexeu no caixão dela. E o Brasil levou anos para descobrir.</w:t>
       </w:r>
     </w:p>
     <w:p>
@@ -31,7 +31,7 @@
         <w:rPr>
           <w:color w:val="C00000"/>
         </w:rPr>
-        <w:t>Fique até o final, porque você vai descobrir o que encontraram dentro daquela sepultura. E quem teve coragem de desobedecer a última vontade de Dercy Gonçalves.</w:t>
+        <w:t>Fique até o final, porque você vai descobrir o que encontraram naquele túmulo. E quem teve coragem de desobedecer a última vontade de Dercy Gonçalves.</w:t>
       </w:r>
     </w:p>
     <w:p>

</xml_diff>

<commit_message>
Dercy Parte 1: gancho insinua o que encontraram no caixão
Co-Authored-By: Claude Opus 5.5 <noreply@anthropic.com>
Claude-Session: https://claude.ai/code/session_01MJjUEEZrxQDEUifKK2vj9g
</commit_message>
<xml_diff>
--- a/roteiros/dercy/Dercy_Parte1.docx
+++ b/roteiros/dercy/Dercy_Parte1.docx
@@ -15,7 +15,7 @@
         <w:rPr>
           <w:color w:val="C00000"/>
         </w:rPr>
-        <w:t>Dercy Gonçalves morreu em dois mil e oito, aos cento e um anos. Oito anos depois, abriram o túmulo dela diante das câmeras. E o que viram naquele caixão revelou uma traição arrepiante.</w:t>
+        <w:t>Dercy Gonçalves morreu em dois mil e oito, aos cento e um anos. Oito anos depois, abriram o túmulo dela diante das câmeras e encontraram, naquele caixão, uma coisa que tinha sido escondida do Brasil inteiro.</w:t>
       </w:r>
     </w:p>
     <w:p>
@@ -23,7 +23,7 @@
         <w:rPr>
           <w:color w:val="C00000"/>
         </w:rPr>
-        <w:t>O que pouca gente sabe é que, poucos dias depois do enterro, alguém voltou àquele túmulo, às escondidas, e mexeu no caixão dela. E o Brasil levou anos para descobrir.</w:t>
+        <w:t>O que pouca gente sabe é que alguém mexeu naquele caixão poucos dias depois do enterro, às escondidas. E fez isso contra a última vontade dela.</w:t>
       </w:r>
     </w:p>
     <w:p>
@@ -31,7 +31,7 @@
         <w:rPr>
           <w:color w:val="C00000"/>
         </w:rPr>
-        <w:t>Fique até o final, porque você vai descobrir o que encontraram naquele túmulo. E quem teve coragem de desobedecer a última vontade de Dercy Gonçalves.</w:t>
+        <w:t>Fique até o final, porque você vai descobrir o que encontraram dentro daquele túmulo. E quem teve coragem de fazer isso com o caixão de Dercy Gonçalves.</w:t>
       </w:r>
     </w:p>
     <w:p>

</xml_diff>

<commit_message>
Dercy Parte 1: revisão
Co-Authored-By: Claude Opus 5.5 <noreply@anthropic.com>
Claude-Session: https://claude.ai/code/session_01MJjUEEZrxQDEUifKK2vj9g
</commit_message>
<xml_diff>
--- a/roteiros/dercy/Dercy_Parte1.docx
+++ b/roteiros/dercy/Dercy_Parte1.docx
@@ -23,7 +23,7 @@
         <w:rPr>
           <w:color w:val="C00000"/>
         </w:rPr>
-        <w:t>O que pouca gente sabe é que alguém mexeu naquele caixão poucos dias depois do enterro, às escondidas. E fez isso contra a última vontade dela.</w:t>
+        <w:t>O que pouca gente sabe é que alguém mexeu naquele caixão um dia depois do enterro, às escondidas. E fez isso contra a última vontade dela.</w:t>
       </w:r>
     </w:p>
     <w:p>
@@ -71,7 +71,7 @@
         <w:rPr>
           <w:color w:val="000000"/>
         </w:rPr>
-        <w:t>Fica na serra fluminense, a algumas horas da capital. Uma cidade pequena, de ruas estreitas, onde todo mundo conhece todo mundo.</w:t>
+        <w:t>Fica na serra fluminense, a algumas horas da capital. Ruas estreitas, onde todo mundo conhece todo mundo.</w:t>
       </w:r>
     </w:p>
     <w:p>
@@ -79,7 +79,7 @@
         <w:rPr>
           <w:color w:val="000000"/>
         </w:rPr>
-        <w:t>Hoje, quem entra nesse cemitério vê uma construção que não combina com nada em volta.</w:t>
+        <w:t>Hoje, quem entra no cemitério da cidade vê uma construção que não combina com nada em volta.</w:t>
       </w:r>
     </w:p>
     <w:p>
@@ -111,7 +111,7 @@
         <w:rPr>
           <w:color w:val="000000"/>
         </w:rPr>
-        <w:t>Começa no dia vinte e três de junho de mil novecentos e sete, segundo o registro. Ela própria jurava ter nascido dois anos antes, e que o pai só tinha ido ao cartório depois.</w:t>
+        <w:t>Começa no dia vinte e três de junho de mil novecentos e sete, segundo o registro. Ela própria jurava ter nascido dois anos antes, e que só foi registrada depois.</w:t>
       </w:r>
     </w:p>
     <w:p>
@@ -191,7 +191,7 @@
         <w:rPr>
           <w:color w:val="C00000"/>
         </w:rPr>
-        <w:t>O que aquela mãe fez em seguida marcou Dercy para o resto da vida. E ajuda a explicar por que, oitenta anos depois, ela não quis depender de ninguém nem para decidir o que seria feito com o próprio corpo depois da morte.</w:t>
+        <w:t>O que aquela mãe fez em seguida marcou Dercy para o resto da vida. E ajuda a explicar por que, quase um século depois, ela não quis depender de ninguém nem para decidir o que seria feito com o próprio corpo depois da morte.</w:t>
       </w:r>
     </w:p>
     <w:p>
@@ -296,14 +296,6 @@
           <w:color w:val="000000"/>
         </w:rPr>
         <w:t>Anos depois, já famosa, Dercy contou em entrevista que era perseguida na rua desde os sete anos de idade.</w:t>
-      </w:r>
-    </w:p>
-    <w:p>
-      <w:r>
-        <w:rPr>
-          <w:color w:val="000000"/>
-        </w:rPr>
-        <w:t>Ninguém a protegia.</w:t>
       </w:r>
     </w:p>
     <w:p>
@@ -431,7 +423,7 @@
         <w:rPr>
           <w:color w:val="000000"/>
         </w:rPr>
-        <w:t>E, dentro de casa, o pai jamais aceitaria aquilo.</w:t>
+        <w:t>E, dentro de casa, o pai dificilmente aceitaria aquilo.</w:t>
       </w:r>
     </w:p>
     <w:p>
@@ -551,7 +543,7 @@
         <w:rPr>
           <w:color w:val="000000"/>
         </w:rPr>
-        <w:t>Ela só ia voltar para ficar quase um século depois.</w:t>
+        <w:t>Ela só ia voltar para ficar mais de oitenta anos depois.</w:t>
       </w:r>
     </w:p>
     <w:p>

</xml_diff>